<commit_message>
Adding updated word document
</commit_message>
<xml_diff>
--- a/SQL Normalizacion/Ejercicio Normalizacion.docx
+++ b/SQL Normalizacion/Ejercicio Normalizacion.docx
@@ -2052,13 +2052,14 @@
         <w:tblLook w:val="04A0" w:firstRow="1" w:lastRow="0" w:firstColumn="1" w:lastColumn="0" w:noHBand="0" w:noVBand="1"/>
       </w:tblPr>
       <w:tblGrid>
-        <w:gridCol w:w="590"/>
-        <w:gridCol w:w="4675"/>
+        <w:gridCol w:w="581"/>
+        <w:gridCol w:w="4416"/>
+        <w:gridCol w:w="4353"/>
       </w:tblGrid>
       <w:tr>
         <w:tc>
           <w:tcPr>
-            <w:tcW w:w="590" w:type="dxa"/>
+            <w:tcW w:w="581" w:type="dxa"/>
           </w:tcPr>
           <w:p>
             <w:pPr>
@@ -2079,7 +2080,7 @@
         </w:tc>
         <w:tc>
           <w:tcPr>
-            <w:tcW w:w="4675" w:type="dxa"/>
+            <w:tcW w:w="4416" w:type="dxa"/>
           </w:tcPr>
           <w:p>
             <w:pPr>
@@ -2095,6 +2096,27 @@
                 <w:lang w:val="es-CR"/>
               </w:rPr>
               <w:t>Address</w:t>
+            </w:r>
+          </w:p>
+        </w:tc>
+        <w:tc>
+          <w:tcPr>
+            <w:tcW w:w="4353" w:type="dxa"/>
+          </w:tcPr>
+          <w:p>
+            <w:pPr>
+              <w:jc w:val="center"/>
+              <w:rPr>
+                <w:rFonts w:ascii="Arial" w:hAnsi="Arial" w:cs="Arial"/>
+                <w:lang w:val="es-CR"/>
+              </w:rPr>
+            </w:pPr>
+            <w:r>
+              <w:rPr>
+                <w:rFonts w:ascii="Arial" w:hAnsi="Arial" w:cs="Arial"/>
+                <w:lang w:val="es-CR"/>
+              </w:rPr>
+              <w:t>Customer_id</w:t>
             </w:r>
           </w:p>
         </w:tc>
@@ -2102,7 +2124,7 @@
       <w:tr>
         <w:tc>
           <w:tcPr>
-            <w:tcW w:w="590" w:type="dxa"/>
+            <w:tcW w:w="581" w:type="dxa"/>
           </w:tcPr>
           <w:p>
             <w:pPr>
@@ -2123,7 +2145,7 @@
         </w:tc>
         <w:tc>
           <w:tcPr>
-            <w:tcW w:w="4675" w:type="dxa"/>
+            <w:tcW w:w="4416" w:type="dxa"/>
           </w:tcPr>
           <w:p>
             <w:pPr>
@@ -2139,6 +2161,27 @@
                 <w:lang w:val="es-CR"/>
               </w:rPr>
               <w:t>123 Main St</w:t>
+            </w:r>
+          </w:p>
+        </w:tc>
+        <w:tc>
+          <w:tcPr>
+            <w:tcW w:w="4353" w:type="dxa"/>
+          </w:tcPr>
+          <w:p>
+            <w:pPr>
+              <w:jc w:val="center"/>
+              <w:rPr>
+                <w:rFonts w:ascii="Arial" w:hAnsi="Arial" w:cs="Arial"/>
+                <w:lang w:val="es-CR"/>
+              </w:rPr>
+            </w:pPr>
+            <w:r>
+              <w:rPr>
+                <w:rFonts w:ascii="Arial" w:hAnsi="Arial" w:cs="Arial"/>
+                <w:lang w:val="es-CR"/>
+              </w:rPr>
+              <w:t>1</w:t>
             </w:r>
           </w:p>
         </w:tc>
@@ -2146,7 +2189,7 @@
       <w:tr>
         <w:tc>
           <w:tcPr>
-            <w:tcW w:w="590" w:type="dxa"/>
+            <w:tcW w:w="581" w:type="dxa"/>
           </w:tcPr>
           <w:p>
             <w:pPr>
@@ -2167,7 +2210,7 @@
         </w:tc>
         <w:tc>
           <w:tcPr>
-            <w:tcW w:w="4675" w:type="dxa"/>
+            <w:tcW w:w="4416" w:type="dxa"/>
           </w:tcPr>
           <w:p>
             <w:pPr>
@@ -2183,6 +2226,27 @@
                 <w:lang w:val="es-CR"/>
               </w:rPr>
               <w:t>456 Elm St</w:t>
+            </w:r>
+          </w:p>
+        </w:tc>
+        <w:tc>
+          <w:tcPr>
+            <w:tcW w:w="4353" w:type="dxa"/>
+          </w:tcPr>
+          <w:p>
+            <w:pPr>
+              <w:jc w:val="center"/>
+              <w:rPr>
+                <w:rFonts w:ascii="Arial" w:hAnsi="Arial" w:cs="Arial"/>
+                <w:lang w:val="es-CR"/>
+              </w:rPr>
+            </w:pPr>
+            <w:r>
+              <w:rPr>
+                <w:rFonts w:ascii="Arial" w:hAnsi="Arial" w:cs="Arial"/>
+                <w:lang w:val="es-CR"/>
+              </w:rPr>
+              <w:t>2</w:t>
             </w:r>
           </w:p>
         </w:tc>
@@ -2190,7 +2254,7 @@
       <w:tr>
         <w:tc>
           <w:tcPr>
-            <w:tcW w:w="590" w:type="dxa"/>
+            <w:tcW w:w="581" w:type="dxa"/>
           </w:tcPr>
           <w:p>
             <w:pPr>
@@ -2211,7 +2275,7 @@
         </w:tc>
         <w:tc>
           <w:tcPr>
-            <w:tcW w:w="4675" w:type="dxa"/>
+            <w:tcW w:w="4416" w:type="dxa"/>
           </w:tcPr>
           <w:p>
             <w:pPr>
@@ -2227,6 +2291,27 @@
                 <w:lang w:val="es-CR"/>
               </w:rPr>
               <w:t>789 Oak St</w:t>
+            </w:r>
+          </w:p>
+        </w:tc>
+        <w:tc>
+          <w:tcPr>
+            <w:tcW w:w="4353" w:type="dxa"/>
+          </w:tcPr>
+          <w:p>
+            <w:pPr>
+              <w:jc w:val="center"/>
+              <w:rPr>
+                <w:rFonts w:ascii="Arial" w:hAnsi="Arial" w:cs="Arial"/>
+                <w:lang w:val="es-CR"/>
+              </w:rPr>
+            </w:pPr>
+            <w:r>
+              <w:rPr>
+                <w:rFonts w:ascii="Arial" w:hAnsi="Arial" w:cs="Arial"/>
+                <w:lang w:val="es-CR"/>
+              </w:rPr>
+              <w:t>3</w:t>
             </w:r>
           </w:p>
         </w:tc>
@@ -2234,7 +2319,7 @@
       <w:tr>
         <w:tc>
           <w:tcPr>
-            <w:tcW w:w="590" w:type="dxa"/>
+            <w:tcW w:w="581" w:type="dxa"/>
           </w:tcPr>
           <w:p>
             <w:pPr>
@@ -2255,7 +2340,7 @@
         </w:tc>
         <w:tc>
           <w:tcPr>
-            <w:tcW w:w="4675" w:type="dxa"/>
+            <w:tcW w:w="4416" w:type="dxa"/>
           </w:tcPr>
           <w:p>
             <w:pPr>
@@ -2271,6 +2356,27 @@
                 <w:lang w:val="es-CR"/>
               </w:rPr>
               <w:t>789 Georgia St</w:t>
+            </w:r>
+          </w:p>
+        </w:tc>
+        <w:tc>
+          <w:tcPr>
+            <w:tcW w:w="4353" w:type="dxa"/>
+          </w:tcPr>
+          <w:p>
+            <w:pPr>
+              <w:jc w:val="center"/>
+              <w:rPr>
+                <w:rFonts w:ascii="Arial" w:hAnsi="Arial" w:cs="Arial"/>
+                <w:lang w:val="es-CR"/>
+              </w:rPr>
+            </w:pPr>
+            <w:r>
+              <w:rPr>
+                <w:rFonts w:ascii="Arial" w:hAnsi="Arial" w:cs="Arial"/>
+                <w:lang w:val="es-CR"/>
+              </w:rPr>
+              <w:t>3</w:t>
             </w:r>
           </w:p>
         </w:tc>
@@ -3082,15 +3188,13 @@
         </w:rPr>
         <w:t xml:space="preserve">He eliminado la tabla de Delivery times ya que parecía no ser necesaria. </w:t>
       </w:r>
-      <w:proofErr w:type="spellStart"/>
       <w:r>
         <w:rPr>
           <w:rFonts w:ascii="Arial" w:hAnsi="Arial" w:cs="Arial"/>
           <w:lang w:val="es-CR"/>
         </w:rPr>
-        <w:t>Ademas</w:t>
+        <w:t>Además</w:t>
       </w:r>
-      <w:proofErr w:type="spellEnd"/>
       <w:r>
         <w:rPr>
           <w:rFonts w:ascii="Arial" w:hAnsi="Arial" w:cs="Arial"/>
@@ -4236,6 +4340,7 @@
           </w:tcPr>
           <w:p>
             <w:pPr>
+              <w:jc w:val="center"/>
               <w:rPr>
                 <w:rFonts w:ascii="Arial" w:hAnsi="Arial" w:cs="Arial"/>
                 <w:lang w:val="es-CR"/>
@@ -4256,6 +4361,7 @@
           </w:tcPr>
           <w:p>
             <w:pPr>
+              <w:jc w:val="center"/>
               <w:rPr>
                 <w:rFonts w:ascii="Arial" w:hAnsi="Arial" w:cs="Arial"/>
                 <w:lang w:val="es-CR"/>
@@ -4276,6 +4382,7 @@
           </w:tcPr>
           <w:p>
             <w:pPr>
+              <w:jc w:val="center"/>
               <w:rPr>
                 <w:rFonts w:ascii="Arial" w:hAnsi="Arial" w:cs="Arial"/>
                 <w:lang w:val="es-CR"/>
@@ -4296,6 +4403,7 @@
           </w:tcPr>
           <w:p>
             <w:pPr>
+              <w:jc w:val="center"/>
               <w:rPr>
                 <w:rFonts w:ascii="Arial" w:hAnsi="Arial" w:cs="Arial"/>
                 <w:lang w:val="es-CR"/>
@@ -4316,6 +4424,7 @@
           </w:tcPr>
           <w:p>
             <w:pPr>
+              <w:jc w:val="center"/>
               <w:rPr>
                 <w:rFonts w:ascii="Arial" w:hAnsi="Arial" w:cs="Arial"/>
                 <w:lang w:val="es-CR"/>
@@ -4336,6 +4445,7 @@
           </w:tcPr>
           <w:p>
             <w:pPr>
+              <w:jc w:val="center"/>
               <w:rPr>
                 <w:rFonts w:ascii="Arial" w:hAnsi="Arial" w:cs="Arial"/>
                 <w:lang w:val="es-CR"/>
@@ -4356,6 +4466,7 @@
           </w:tcPr>
           <w:p>
             <w:pPr>
+              <w:jc w:val="center"/>
               <w:rPr>
                 <w:rFonts w:ascii="Arial" w:hAnsi="Arial" w:cs="Arial"/>
                 <w:lang w:val="es-CR"/>
@@ -4383,6 +4494,7 @@
           </w:tcPr>
           <w:p>
             <w:pPr>
+              <w:jc w:val="center"/>
               <w:rPr>
                 <w:rFonts w:ascii="Arial" w:hAnsi="Arial" w:cs="Arial"/>
                 <w:lang w:val="es-CR"/>
@@ -4410,6 +4522,7 @@
           </w:tcPr>
           <w:p>
             <w:pPr>
+              <w:jc w:val="center"/>
               <w:rPr>
                 <w:rFonts w:ascii="Arial" w:hAnsi="Arial" w:cs="Arial"/>
                 <w:lang w:val="es-CR"/>
@@ -4430,6 +4543,7 @@
           </w:tcPr>
           <w:p>
             <w:pPr>
+              <w:jc w:val="center"/>
               <w:rPr>
                 <w:rFonts w:ascii="Arial" w:hAnsi="Arial" w:cs="Arial"/>
                 <w:lang w:val="es-CR"/>
@@ -5573,7 +5687,6 @@
         <w:gridCol w:w="579"/>
         <w:gridCol w:w="4234"/>
         <w:gridCol w:w="884"/>
-        <w:gridCol w:w="1911"/>
       </w:tblGrid>
       <w:tr>
         <w:tc>
@@ -5639,27 +5752,6 @@
             </w:r>
           </w:p>
         </w:tc>
-        <w:tc>
-          <w:tcPr>
-            <w:tcW w:w="884" w:type="dxa"/>
-          </w:tcPr>
-          <w:p>
-            <w:pPr>
-              <w:jc w:val="center"/>
-              <w:rPr>
-                <w:rFonts w:ascii="Arial" w:hAnsi="Arial" w:cs="Arial"/>
-                <w:lang w:val="es-CR"/>
-              </w:rPr>
-            </w:pPr>
-            <w:r>
-              <w:rPr>
-                <w:rFonts w:ascii="Arial" w:hAnsi="Arial" w:cs="Arial"/>
-                <w:lang w:val="es-CR"/>
-              </w:rPr>
-              <w:t>VIN</w:t>
-            </w:r>
-          </w:p>
-        </w:tc>
       </w:tr>
       <w:tr>
         <w:tc>
@@ -5725,27 +5817,6 @@
             </w:r>
           </w:p>
         </w:tc>
-        <w:tc>
-          <w:tcPr>
-            <w:tcW w:w="884" w:type="dxa"/>
-          </w:tcPr>
-          <w:p>
-            <w:pPr>
-              <w:jc w:val="center"/>
-              <w:rPr>
-                <w:rFonts w:ascii="Arial" w:hAnsi="Arial" w:cs="Arial"/>
-                <w:lang w:val="es-CR"/>
-              </w:rPr>
-            </w:pPr>
-            <w:r>
-              <w:rPr>
-                <w:rFonts w:ascii="Arial" w:hAnsi="Arial" w:cs="Arial"/>
-                <w:lang w:val="es-CR"/>
-              </w:rPr>
-              <w:t>1HGCM82633A</w:t>
-            </w:r>
-          </w:p>
-        </w:tc>
       </w:tr>
       <w:tr>
         <w:tc>
@@ -5811,27 +5882,6 @@
             </w:r>
           </w:p>
         </w:tc>
-        <w:tc>
-          <w:tcPr>
-            <w:tcW w:w="884" w:type="dxa"/>
-          </w:tcPr>
-          <w:p>
-            <w:pPr>
-              <w:jc w:val="center"/>
-              <w:rPr>
-                <w:rFonts w:ascii="Arial" w:hAnsi="Arial" w:cs="Arial"/>
-                <w:lang w:val="es-CR"/>
-              </w:rPr>
-            </w:pPr>
-            <w:r>
-              <w:rPr>
-                <w:rFonts w:ascii="Arial" w:hAnsi="Arial" w:cs="Arial"/>
-                <w:lang w:val="es-CR"/>
-              </w:rPr>
-              <w:t>5J6RM4H79EL</w:t>
-            </w:r>
-          </w:p>
-        </w:tc>
       </w:tr>
       <w:tr>
         <w:tc>
@@ -5894,27 +5944,6 @@
                 <w:lang w:val="es-CR"/>
               </w:rPr>
               <w:t>2015</w:t>
-            </w:r>
-          </w:p>
-        </w:tc>
-        <w:tc>
-          <w:tcPr>
-            <w:tcW w:w="884" w:type="dxa"/>
-          </w:tcPr>
-          <w:p>
-            <w:pPr>
-              <w:jc w:val="center"/>
-              <w:rPr>
-                <w:rFonts w:ascii="Arial" w:hAnsi="Arial" w:cs="Arial"/>
-                <w:lang w:val="es-CR"/>
-              </w:rPr>
-            </w:pPr>
-            <w:r>
-              <w:rPr>
-                <w:rFonts w:ascii="Arial" w:hAnsi="Arial" w:cs="Arial"/>
-                <w:lang w:val="es-CR"/>
-              </w:rPr>
-              <w:t>1G1RA6H1FU</w:t>
             </w:r>
           </w:p>
         </w:tc>
@@ -6537,6 +6566,263 @@
           <w:rFonts w:ascii="Arial" w:hAnsi="Arial" w:cs="Arial"/>
           <w:lang w:val="es-CR"/>
         </w:rPr>
+        <w:t>Insurance Companies</w:t>
+      </w:r>
+    </w:p>
+    <w:tbl>
+      <w:tblPr>
+        <w:tblStyle w:val="TableGrid"/>
+        <w:tblW w:w="0" w:type="auto"/>
+        <w:tblInd w:w="360" w:type="dxa"/>
+        <w:tblLook w:val="04A0" w:firstRow="1" w:lastRow="0" w:firstColumn="1" w:lastColumn="0" w:noHBand="0" w:noVBand="1"/>
+      </w:tblPr>
+      <w:tblGrid>
+        <w:gridCol w:w="590"/>
+        <w:gridCol w:w="4495"/>
+      </w:tblGrid>
+      <w:tr>
+        <w:tc>
+          <w:tcPr>
+            <w:tcW w:w="590" w:type="dxa"/>
+          </w:tcPr>
+          <w:p>
+            <w:pPr>
+              <w:jc w:val="center"/>
+              <w:rPr>
+                <w:rFonts w:ascii="Arial" w:hAnsi="Arial" w:cs="Arial"/>
+                <w:lang w:val="es-CR"/>
+              </w:rPr>
+            </w:pPr>
+            <w:r>
+              <w:rPr>
+                <w:rFonts w:ascii="Arial" w:hAnsi="Arial" w:cs="Arial"/>
+                <w:lang w:val="es-CR"/>
+              </w:rPr>
+              <w:t>ID</w:t>
+            </w:r>
+          </w:p>
+        </w:tc>
+        <w:tc>
+          <w:tcPr>
+            <w:tcW w:w="4495" w:type="dxa"/>
+          </w:tcPr>
+          <w:p>
+            <w:pPr>
+              <w:jc w:val="center"/>
+              <w:rPr>
+                <w:rFonts w:ascii="Arial" w:hAnsi="Arial" w:cs="Arial"/>
+                <w:lang w:val="es-CR"/>
+              </w:rPr>
+            </w:pPr>
+            <w:r>
+              <w:rPr>
+                <w:rFonts w:ascii="Arial" w:hAnsi="Arial" w:cs="Arial"/>
+                <w:lang w:val="es-CR"/>
+              </w:rPr>
+              <w:t>Name</w:t>
+            </w:r>
+          </w:p>
+        </w:tc>
+      </w:tr>
+      <w:tr>
+        <w:tc>
+          <w:tcPr>
+            <w:tcW w:w="590" w:type="dxa"/>
+          </w:tcPr>
+          <w:p>
+            <w:pPr>
+              <w:jc w:val="center"/>
+              <w:rPr>
+                <w:rFonts w:ascii="Arial" w:hAnsi="Arial" w:cs="Arial"/>
+                <w:lang w:val="es-CR"/>
+              </w:rPr>
+            </w:pPr>
+            <w:r>
+              <w:rPr>
+                <w:rFonts w:ascii="Arial" w:hAnsi="Arial" w:cs="Arial"/>
+                <w:lang w:val="es-CR"/>
+              </w:rPr>
+              <w:t>1</w:t>
+            </w:r>
+          </w:p>
+        </w:tc>
+        <w:tc>
+          <w:tcPr>
+            <w:tcW w:w="4495" w:type="dxa"/>
+          </w:tcPr>
+          <w:p>
+            <w:pPr>
+              <w:jc w:val="center"/>
+              <w:rPr>
+                <w:rFonts w:ascii="Arial" w:hAnsi="Arial" w:cs="Arial"/>
+                <w:lang w:val="es-CR"/>
+              </w:rPr>
+            </w:pPr>
+            <w:r>
+              <w:rPr>
+                <w:rFonts w:ascii="Arial" w:hAnsi="Arial" w:cs="Arial"/>
+                <w:lang w:val="es-CR"/>
+              </w:rPr>
+              <w:t>ABC Insurance</w:t>
+            </w:r>
+          </w:p>
+        </w:tc>
+      </w:tr>
+      <w:tr>
+        <w:tc>
+          <w:tcPr>
+            <w:tcW w:w="590" w:type="dxa"/>
+          </w:tcPr>
+          <w:p>
+            <w:pPr>
+              <w:jc w:val="center"/>
+              <w:rPr>
+                <w:rFonts w:ascii="Arial" w:hAnsi="Arial" w:cs="Arial"/>
+                <w:lang w:val="es-CR"/>
+              </w:rPr>
+            </w:pPr>
+            <w:r>
+              <w:rPr>
+                <w:rFonts w:ascii="Arial" w:hAnsi="Arial" w:cs="Arial"/>
+                <w:lang w:val="es-CR"/>
+              </w:rPr>
+              <w:t>2</w:t>
+            </w:r>
+          </w:p>
+        </w:tc>
+        <w:tc>
+          <w:tcPr>
+            <w:tcW w:w="4495" w:type="dxa"/>
+          </w:tcPr>
+          <w:p>
+            <w:pPr>
+              <w:jc w:val="center"/>
+              <w:rPr>
+                <w:rFonts w:ascii="Arial" w:hAnsi="Arial" w:cs="Arial"/>
+                <w:lang w:val="es-CR"/>
+              </w:rPr>
+            </w:pPr>
+            <w:r>
+              <w:rPr>
+                <w:rFonts w:ascii="Arial" w:hAnsi="Arial" w:cs="Arial"/>
+                <w:lang w:val="es-CR"/>
+              </w:rPr>
+              <w:t>XYZ Insurance</w:t>
+            </w:r>
+          </w:p>
+        </w:tc>
+      </w:tr>
+      <w:tr>
+        <w:tc>
+          <w:tcPr>
+            <w:tcW w:w="590" w:type="dxa"/>
+          </w:tcPr>
+          <w:p>
+            <w:pPr>
+              <w:jc w:val="center"/>
+              <w:rPr>
+                <w:rFonts w:ascii="Arial" w:hAnsi="Arial" w:cs="Arial"/>
+                <w:lang w:val="es-CR"/>
+              </w:rPr>
+            </w:pPr>
+            <w:r>
+              <w:rPr>
+                <w:rFonts w:ascii="Arial" w:hAnsi="Arial" w:cs="Arial"/>
+                <w:lang w:val="es-CR"/>
+              </w:rPr>
+              <w:t>3</w:t>
+            </w:r>
+          </w:p>
+        </w:tc>
+        <w:tc>
+          <w:tcPr>
+            <w:tcW w:w="4495" w:type="dxa"/>
+          </w:tcPr>
+          <w:p>
+            <w:pPr>
+              <w:jc w:val="center"/>
+              <w:rPr>
+                <w:rFonts w:ascii="Arial" w:hAnsi="Arial" w:cs="Arial"/>
+                <w:lang w:val="es-CR"/>
+              </w:rPr>
+            </w:pPr>
+            <w:r>
+              <w:rPr>
+                <w:rFonts w:ascii="Arial" w:hAnsi="Arial" w:cs="Arial"/>
+                <w:lang w:val="es-CR"/>
+              </w:rPr>
+              <w:t>DEF Insurance</w:t>
+            </w:r>
+          </w:p>
+        </w:tc>
+      </w:tr>
+      <w:tr>
+        <w:tc>
+          <w:tcPr>
+            <w:tcW w:w="590" w:type="dxa"/>
+          </w:tcPr>
+          <w:p>
+            <w:pPr>
+              <w:jc w:val="center"/>
+              <w:rPr>
+                <w:rFonts w:ascii="Arial" w:hAnsi="Arial" w:cs="Arial"/>
+                <w:lang w:val="es-CR"/>
+              </w:rPr>
+            </w:pPr>
+            <w:r>
+              <w:rPr>
+                <w:rFonts w:ascii="Arial" w:hAnsi="Arial" w:cs="Arial"/>
+                <w:lang w:val="es-CR"/>
+              </w:rPr>
+              <w:t>4</w:t>
+            </w:r>
+          </w:p>
+        </w:tc>
+        <w:tc>
+          <w:tcPr>
+            <w:tcW w:w="4495" w:type="dxa"/>
+          </w:tcPr>
+          <w:p>
+            <w:pPr>
+              <w:jc w:val="center"/>
+              <w:rPr>
+                <w:rFonts w:ascii="Arial" w:hAnsi="Arial" w:cs="Arial"/>
+                <w:lang w:val="es-CR"/>
+              </w:rPr>
+            </w:pPr>
+            <w:r>
+              <w:rPr>
+                <w:rFonts w:ascii="Arial" w:hAnsi="Arial" w:cs="Arial"/>
+                <w:lang w:val="es-CR"/>
+              </w:rPr>
+              <w:t>GHI Insurance</w:t>
+            </w:r>
+          </w:p>
+        </w:tc>
+      </w:tr>
+    </w:tbl>
+    <w:p>
+      <w:pPr>
+        <w:ind w:left="360"/>
+        <w:rPr>
+          <w:rFonts w:ascii="Arial" w:hAnsi="Arial" w:cs="Arial"/>
+          <w:lang w:val="es-CR"/>
+        </w:rPr>
+      </w:pPr>
+    </w:p>
+    <w:p>
+      <w:pPr>
+        <w:ind w:left="360"/>
+        <w:rPr>
+          <w:rFonts w:ascii="Arial" w:hAnsi="Arial" w:cs="Arial"/>
+          <w:lang w:val="es-CR"/>
+        </w:rPr>
+      </w:pPr>
+      <w:r>
+        <w:rPr>
+          <w:rFonts w:ascii="Arial" w:hAnsi="Arial" w:cs="Arial"/>
+          <w:lang w:val="es-CR"/>
+        </w:rPr>
         <w:t>Policies</w:t>
       </w:r>
     </w:p>
@@ -6612,7 +6898,7 @@
                 <w:rFonts w:ascii="Arial" w:hAnsi="Arial" w:cs="Arial"/>
                 <w:lang w:val="es-CR"/>
               </w:rPr>
-              <w:t>Insurance Company</w:t>
+              <w:t>Company_id</w:t>
             </w:r>
           </w:p>
         </w:tc>
@@ -6677,7 +6963,7 @@
                 <w:rFonts w:ascii="Arial" w:hAnsi="Arial" w:cs="Arial"/>
                 <w:lang w:val="es-CR"/>
               </w:rPr>
-              <w:t>ABC Insurance</w:t>
+              <w:t>1</w:t>
             </w:r>
           </w:p>
         </w:tc>
@@ -6742,7 +7028,7 @@
                 <w:rFonts w:ascii="Arial" w:hAnsi="Arial" w:cs="Arial"/>
                 <w:lang w:val="es-CR"/>
               </w:rPr>
-              <w:t>XYZ Insurance</w:t>
+              <w:t>2</w:t>
             </w:r>
           </w:p>
         </w:tc>
@@ -6807,7 +7093,7 @@
                 <w:rFonts w:ascii="Arial" w:hAnsi="Arial" w:cs="Arial"/>
                 <w:lang w:val="es-CR"/>
               </w:rPr>
-              <w:t>DEF Insurance</w:t>
+              <w:t>3</w:t>
             </w:r>
           </w:p>
         </w:tc>
@@ -6872,7 +7158,7 @@
                 <w:rFonts w:ascii="Arial" w:hAnsi="Arial" w:cs="Arial"/>
                 <w:lang w:val="es-CR"/>
               </w:rPr>
-              <w:t>GHI Insurance</w:t>
+              <w:t>4</w:t>
             </w:r>
           </w:p>
         </w:tc>
@@ -6915,22 +7201,23 @@
     <w:tbl>
       <w:tblPr>
         <w:tblStyle w:val="TableGrid"/>
-        <w:tblW w:w="7235" w:type="dxa"/>
+        <w:tblW w:w="8969" w:type="dxa"/>
         <w:tblInd w:w="360" w:type="dxa"/>
         <w:tblLook w:val="04A0" w:firstRow="1" w:lastRow="0" w:firstColumn="1" w:lastColumn="0" w:noHBand="0" w:noVBand="1"/>
       </w:tblPr>
       <w:tblGrid>
-        <w:gridCol w:w="590"/>
-        <w:gridCol w:w="1257"/>
-        <w:gridCol w:w="1324"/>
-        <w:gridCol w:w="1377"/>
-        <w:gridCol w:w="1377"/>
-        <w:gridCol w:w="1310"/>
+        <w:gridCol w:w="546"/>
+        <w:gridCol w:w="2044"/>
+        <w:gridCol w:w="1213"/>
+        <w:gridCol w:w="1279"/>
+        <w:gridCol w:w="1288"/>
+        <w:gridCol w:w="1333"/>
+        <w:gridCol w:w="1266"/>
       </w:tblGrid>
       <w:tr>
         <w:tc>
           <w:tcPr>
-            <w:tcW w:w="590" w:type="dxa"/>
+            <w:tcW w:w="546" w:type="dxa"/>
           </w:tcPr>
           <w:p>
             <w:pPr>
@@ -6951,17 +7238,37 @@
         </w:tc>
         <w:tc>
           <w:tcPr>
-            <w:tcW w:w="1257" w:type="dxa"/>
-          </w:tcPr>
-          <w:p>
-            <w:pPr>
-              <w:jc w:val="center"/>
-              <w:rPr>
-                <w:rFonts w:ascii="Arial" w:hAnsi="Arial" w:cs="Arial"/>
-                <w:lang w:val="es-CR"/>
-              </w:rPr>
-            </w:pPr>
-            <w:proofErr w:type="spellStart"/>
+            <w:tcW w:w="2044" w:type="dxa"/>
+          </w:tcPr>
+          <w:p>
+            <w:pPr>
+              <w:jc w:val="center"/>
+              <w:rPr>
+                <w:rFonts w:ascii="Arial" w:hAnsi="Arial" w:cs="Arial"/>
+                <w:lang w:val="es-CR"/>
+              </w:rPr>
+            </w:pPr>
+            <w:r>
+              <w:rPr>
+                <w:rFonts w:ascii="Arial" w:hAnsi="Arial" w:cs="Arial"/>
+                <w:lang w:val="es-CR"/>
+              </w:rPr>
+              <w:t>VIN</w:t>
+            </w:r>
+          </w:p>
+        </w:tc>
+        <w:tc>
+          <w:tcPr>
+            <w:tcW w:w="1213" w:type="dxa"/>
+          </w:tcPr>
+          <w:p>
+            <w:pPr>
+              <w:jc w:val="center"/>
+              <w:rPr>
+                <w:rFonts w:ascii="Arial" w:hAnsi="Arial" w:cs="Arial"/>
+                <w:lang w:val="es-CR"/>
+              </w:rPr>
+            </w:pPr>
             <w:r>
               <w:rPr>
                 <w:rFonts w:ascii="Arial" w:hAnsi="Arial" w:cs="Arial"/>
@@ -6969,22 +7276,20 @@
               </w:rPr>
               <w:t>Make_id</w:t>
             </w:r>
-            <w:proofErr w:type="spellEnd"/>
-          </w:p>
-        </w:tc>
-        <w:tc>
-          <w:tcPr>
-            <w:tcW w:w="1324" w:type="dxa"/>
-          </w:tcPr>
-          <w:p>
-            <w:pPr>
-              <w:jc w:val="center"/>
-              <w:rPr>
-                <w:rFonts w:ascii="Arial" w:hAnsi="Arial" w:cs="Arial"/>
-                <w:lang w:val="es-CR"/>
-              </w:rPr>
-            </w:pPr>
-            <w:proofErr w:type="spellStart"/>
+          </w:p>
+        </w:tc>
+        <w:tc>
+          <w:tcPr>
+            <w:tcW w:w="1279" w:type="dxa"/>
+          </w:tcPr>
+          <w:p>
+            <w:pPr>
+              <w:jc w:val="center"/>
+              <w:rPr>
+                <w:rFonts w:ascii="Arial" w:hAnsi="Arial" w:cs="Arial"/>
+                <w:lang w:val="es-CR"/>
+              </w:rPr>
+            </w:pPr>
             <w:r>
               <w:rPr>
                 <w:rFonts w:ascii="Arial" w:hAnsi="Arial" w:cs="Arial"/>
@@ -6992,22 +7297,20 @@
               </w:rPr>
               <w:t>Model_id</w:t>
             </w:r>
-            <w:proofErr w:type="spellEnd"/>
-          </w:p>
-        </w:tc>
-        <w:tc>
-          <w:tcPr>
-            <w:tcW w:w="1377" w:type="dxa"/>
-          </w:tcPr>
-          <w:p>
-            <w:pPr>
-              <w:jc w:val="center"/>
-              <w:rPr>
-                <w:rFonts w:ascii="Arial" w:hAnsi="Arial" w:cs="Arial"/>
-                <w:lang w:val="es-CR"/>
-              </w:rPr>
-            </w:pPr>
-            <w:proofErr w:type="spellStart"/>
+          </w:p>
+        </w:tc>
+        <w:tc>
+          <w:tcPr>
+            <w:tcW w:w="1288" w:type="dxa"/>
+          </w:tcPr>
+          <w:p>
+            <w:pPr>
+              <w:jc w:val="center"/>
+              <w:rPr>
+                <w:rFonts w:ascii="Arial" w:hAnsi="Arial" w:cs="Arial"/>
+                <w:lang w:val="es-CR"/>
+              </w:rPr>
+            </w:pPr>
             <w:r>
               <w:rPr>
                 <w:rFonts w:ascii="Arial" w:hAnsi="Arial" w:cs="Arial"/>
@@ -7015,22 +7318,20 @@
               </w:rPr>
               <w:t>Color_id</w:t>
             </w:r>
-            <w:proofErr w:type="spellEnd"/>
-          </w:p>
-        </w:tc>
-        <w:tc>
-          <w:tcPr>
-            <w:tcW w:w="1377" w:type="dxa"/>
-          </w:tcPr>
-          <w:p>
-            <w:pPr>
-              <w:jc w:val="center"/>
-              <w:rPr>
-                <w:rFonts w:ascii="Arial" w:hAnsi="Arial" w:cs="Arial"/>
-                <w:lang w:val="es-CR"/>
-              </w:rPr>
-            </w:pPr>
-            <w:proofErr w:type="spellStart"/>
+          </w:p>
+        </w:tc>
+        <w:tc>
+          <w:tcPr>
+            <w:tcW w:w="1333" w:type="dxa"/>
+          </w:tcPr>
+          <w:p>
+            <w:pPr>
+              <w:jc w:val="center"/>
+              <w:rPr>
+                <w:rFonts w:ascii="Arial" w:hAnsi="Arial" w:cs="Arial"/>
+                <w:lang w:val="es-CR"/>
+              </w:rPr>
+            </w:pPr>
             <w:r>
               <w:rPr>
                 <w:rFonts w:ascii="Arial" w:hAnsi="Arial" w:cs="Arial"/>
@@ -7038,22 +7339,20 @@
               </w:rPr>
               <w:t>Owner_id</w:t>
             </w:r>
-            <w:proofErr w:type="spellEnd"/>
-          </w:p>
-        </w:tc>
-        <w:tc>
-          <w:tcPr>
-            <w:tcW w:w="1310" w:type="dxa"/>
-          </w:tcPr>
-          <w:p>
-            <w:pPr>
-              <w:jc w:val="center"/>
-              <w:rPr>
-                <w:rFonts w:ascii="Arial" w:hAnsi="Arial" w:cs="Arial"/>
-                <w:lang w:val="es-CR"/>
-              </w:rPr>
-            </w:pPr>
-            <w:proofErr w:type="spellStart"/>
+          </w:p>
+        </w:tc>
+        <w:tc>
+          <w:tcPr>
+            <w:tcW w:w="1266" w:type="dxa"/>
+          </w:tcPr>
+          <w:p>
+            <w:pPr>
+              <w:jc w:val="center"/>
+              <w:rPr>
+                <w:rFonts w:ascii="Arial" w:hAnsi="Arial" w:cs="Arial"/>
+                <w:lang w:val="es-CR"/>
+              </w:rPr>
+            </w:pPr>
             <w:r>
               <w:rPr>
                 <w:rFonts w:ascii="Arial" w:hAnsi="Arial" w:cs="Arial"/>
@@ -7061,14 +7360,13 @@
               </w:rPr>
               <w:t>Policy_id</w:t>
             </w:r>
-            <w:proofErr w:type="spellEnd"/>
           </w:p>
         </w:tc>
       </w:tr>
       <w:tr>
         <w:tc>
           <w:tcPr>
-            <w:tcW w:w="590" w:type="dxa"/>
+            <w:tcW w:w="546" w:type="dxa"/>
           </w:tcPr>
           <w:p>
             <w:pPr>
@@ -7089,7 +7387,28 @@
         </w:tc>
         <w:tc>
           <w:tcPr>
-            <w:tcW w:w="1257" w:type="dxa"/>
+            <w:tcW w:w="2044" w:type="dxa"/>
+          </w:tcPr>
+          <w:p>
+            <w:pPr>
+              <w:jc w:val="center"/>
+              <w:rPr>
+                <w:rFonts w:ascii="Arial" w:hAnsi="Arial" w:cs="Arial"/>
+                <w:lang w:val="es-CR"/>
+              </w:rPr>
+            </w:pPr>
+            <w:r>
+              <w:rPr>
+                <w:rFonts w:ascii="Arial" w:hAnsi="Arial" w:cs="Arial"/>
+                <w:lang w:val="es-CR"/>
+              </w:rPr>
+              <w:t>1HGCM82633A</w:t>
+            </w:r>
+          </w:p>
+        </w:tc>
+        <w:tc>
+          <w:tcPr>
+            <w:tcW w:w="1213" w:type="dxa"/>
           </w:tcPr>
           <w:p>
             <w:pPr>
@@ -7110,7 +7429,7 @@
         </w:tc>
         <w:tc>
           <w:tcPr>
-            <w:tcW w:w="1324" w:type="dxa"/>
+            <w:tcW w:w="1279" w:type="dxa"/>
           </w:tcPr>
           <w:p>
             <w:pPr>
@@ -7131,7 +7450,7 @@
         </w:tc>
         <w:tc>
           <w:tcPr>
-            <w:tcW w:w="1377" w:type="dxa"/>
+            <w:tcW w:w="1288" w:type="dxa"/>
           </w:tcPr>
           <w:p>
             <w:pPr>
@@ -7152,7 +7471,7 @@
         </w:tc>
         <w:tc>
           <w:tcPr>
-            <w:tcW w:w="1377" w:type="dxa"/>
+            <w:tcW w:w="1333" w:type="dxa"/>
           </w:tcPr>
           <w:p>
             <w:pPr>
@@ -7173,7 +7492,7 @@
         </w:tc>
         <w:tc>
           <w:tcPr>
-            <w:tcW w:w="1310" w:type="dxa"/>
+            <w:tcW w:w="1266" w:type="dxa"/>
           </w:tcPr>
           <w:p>
             <w:pPr>
@@ -7196,7 +7515,7 @@
       <w:tr>
         <w:tc>
           <w:tcPr>
-            <w:tcW w:w="590" w:type="dxa"/>
+            <w:tcW w:w="546" w:type="dxa"/>
           </w:tcPr>
           <w:p>
             <w:pPr>
@@ -7217,7 +7536,28 @@
         </w:tc>
         <w:tc>
           <w:tcPr>
-            <w:tcW w:w="1257" w:type="dxa"/>
+            <w:tcW w:w="2044" w:type="dxa"/>
+          </w:tcPr>
+          <w:p>
+            <w:pPr>
+              <w:jc w:val="center"/>
+              <w:rPr>
+                <w:rFonts w:ascii="Arial" w:hAnsi="Arial" w:cs="Arial"/>
+                <w:lang w:val="es-CR"/>
+              </w:rPr>
+            </w:pPr>
+            <w:r>
+              <w:rPr>
+                <w:rFonts w:ascii="Arial" w:hAnsi="Arial" w:cs="Arial"/>
+                <w:lang w:val="es-CR"/>
+              </w:rPr>
+              <w:t>1HGCM82633A</w:t>
+            </w:r>
+          </w:p>
+        </w:tc>
+        <w:tc>
+          <w:tcPr>
+            <w:tcW w:w="1213" w:type="dxa"/>
           </w:tcPr>
           <w:p>
             <w:pPr>
@@ -7238,7 +7578,7 @@
         </w:tc>
         <w:tc>
           <w:tcPr>
-            <w:tcW w:w="1324" w:type="dxa"/>
+            <w:tcW w:w="1279" w:type="dxa"/>
           </w:tcPr>
           <w:p>
             <w:pPr>
@@ -7259,7 +7599,7 @@
         </w:tc>
         <w:tc>
           <w:tcPr>
-            <w:tcW w:w="1377" w:type="dxa"/>
+            <w:tcW w:w="1288" w:type="dxa"/>
           </w:tcPr>
           <w:p>
             <w:pPr>
@@ -7280,7 +7620,7 @@
         </w:tc>
         <w:tc>
           <w:tcPr>
-            <w:tcW w:w="1377" w:type="dxa"/>
+            <w:tcW w:w="1333" w:type="dxa"/>
           </w:tcPr>
           <w:p>
             <w:pPr>
@@ -7301,7 +7641,7 @@
         </w:tc>
         <w:tc>
           <w:tcPr>
-            <w:tcW w:w="1310" w:type="dxa"/>
+            <w:tcW w:w="1266" w:type="dxa"/>
           </w:tcPr>
           <w:p>
             <w:pPr>
@@ -7324,7 +7664,7 @@
       <w:tr>
         <w:tc>
           <w:tcPr>
-            <w:tcW w:w="590" w:type="dxa"/>
+            <w:tcW w:w="546" w:type="dxa"/>
           </w:tcPr>
           <w:p>
             <w:pPr>
@@ -7345,7 +7685,28 @@
         </w:tc>
         <w:tc>
           <w:tcPr>
-            <w:tcW w:w="1257" w:type="dxa"/>
+            <w:tcW w:w="2044" w:type="dxa"/>
+          </w:tcPr>
+          <w:p>
+            <w:pPr>
+              <w:jc w:val="center"/>
+              <w:rPr>
+                <w:rFonts w:ascii="Arial" w:hAnsi="Arial" w:cs="Arial"/>
+                <w:lang w:val="es-CR"/>
+              </w:rPr>
+            </w:pPr>
+            <w:r>
+              <w:rPr>
+                <w:rFonts w:ascii="Arial" w:hAnsi="Arial" w:cs="Arial"/>
+                <w:lang w:val="es-CR"/>
+              </w:rPr>
+              <w:t>5J6RM4H79EL</w:t>
+            </w:r>
+          </w:p>
+        </w:tc>
+        <w:tc>
+          <w:tcPr>
+            <w:tcW w:w="1213" w:type="dxa"/>
           </w:tcPr>
           <w:p>
             <w:pPr>
@@ -7366,7 +7727,7 @@
         </w:tc>
         <w:tc>
           <w:tcPr>
-            <w:tcW w:w="1324" w:type="dxa"/>
+            <w:tcW w:w="1279" w:type="dxa"/>
           </w:tcPr>
           <w:p>
             <w:pPr>
@@ -7387,7 +7748,7 @@
         </w:tc>
         <w:tc>
           <w:tcPr>
-            <w:tcW w:w="1377" w:type="dxa"/>
+            <w:tcW w:w="1288" w:type="dxa"/>
           </w:tcPr>
           <w:p>
             <w:pPr>
@@ -7408,7 +7769,7 @@
         </w:tc>
         <w:tc>
           <w:tcPr>
-            <w:tcW w:w="1377" w:type="dxa"/>
+            <w:tcW w:w="1333" w:type="dxa"/>
           </w:tcPr>
           <w:p>
             <w:pPr>
@@ -7429,7 +7790,7 @@
         </w:tc>
         <w:tc>
           <w:tcPr>
-            <w:tcW w:w="1310" w:type="dxa"/>
+            <w:tcW w:w="1266" w:type="dxa"/>
           </w:tcPr>
           <w:p>
             <w:pPr>
@@ -7452,7 +7813,7 @@
       <w:tr>
         <w:tc>
           <w:tcPr>
-            <w:tcW w:w="590" w:type="dxa"/>
+            <w:tcW w:w="546" w:type="dxa"/>
           </w:tcPr>
           <w:p>
             <w:pPr>
@@ -7473,7 +7834,28 @@
         </w:tc>
         <w:tc>
           <w:tcPr>
-            <w:tcW w:w="1257" w:type="dxa"/>
+            <w:tcW w:w="2044" w:type="dxa"/>
+          </w:tcPr>
+          <w:p>
+            <w:pPr>
+              <w:jc w:val="center"/>
+              <w:rPr>
+                <w:rFonts w:ascii="Arial" w:hAnsi="Arial" w:cs="Arial"/>
+                <w:lang w:val="es-CR"/>
+              </w:rPr>
+            </w:pPr>
+            <w:r>
+              <w:rPr>
+                <w:rFonts w:ascii="Arial" w:hAnsi="Arial" w:cs="Arial"/>
+                <w:lang w:val="es-CR"/>
+              </w:rPr>
+              <w:t>1G1RA6H1FU</w:t>
+            </w:r>
+          </w:p>
+        </w:tc>
+        <w:tc>
+          <w:tcPr>
+            <w:tcW w:w="1213" w:type="dxa"/>
           </w:tcPr>
           <w:p>
             <w:pPr>
@@ -7494,7 +7876,7 @@
         </w:tc>
         <w:tc>
           <w:tcPr>
-            <w:tcW w:w="1324" w:type="dxa"/>
+            <w:tcW w:w="1279" w:type="dxa"/>
           </w:tcPr>
           <w:p>
             <w:pPr>
@@ -7515,7 +7897,7 @@
         </w:tc>
         <w:tc>
           <w:tcPr>
-            <w:tcW w:w="1377" w:type="dxa"/>
+            <w:tcW w:w="1288" w:type="dxa"/>
           </w:tcPr>
           <w:p>
             <w:pPr>
@@ -7536,7 +7918,7 @@
         </w:tc>
         <w:tc>
           <w:tcPr>
-            <w:tcW w:w="1377" w:type="dxa"/>
+            <w:tcW w:w="1333" w:type="dxa"/>
           </w:tcPr>
           <w:p>
             <w:pPr>
@@ -7557,7 +7939,7 @@
         </w:tc>
         <w:tc>
           <w:tcPr>
-            <w:tcW w:w="1310" w:type="dxa"/>
+            <w:tcW w:w="1266" w:type="dxa"/>
           </w:tcPr>
           <w:p>
             <w:pPr>

</xml_diff>